<commit_message>
docs: documenter la config fournisseur LLM (Groq/OpenAI/Gemini/Anthropic) + compose passthrough
Co-Authored-By: Claude Opus 4.8 (1M context) <noreply@anthropic.com>
</commit_message>
<xml_diff>
--- a/docs/GUIDE-INSTALL-ELEVE.docx
+++ b/docs/GUIDE-INSTALL-ELEVE.docx
@@ -1820,7 +1820,483 @@
         <w:pStyle w:val="Heading1"/>
       </w:pPr>
       <w:r>
-        <w:t>7. Depannage</w:t>
+        <w:t>7. Configurer un fournisseur LLM (cible)</w:t>
+      </w:r>
+    </w:p>
+    <w:p>
+      <w:r>
+        <w:t>Par defaut, l'assistant CIBLE des labs tourne sur Ollama local (100% hors-ligne). Le produit OWASP etant bati sur LiteLLM, cette cible peut tourner sur de nombreux fournisseurs (Groq, OpenAI, Gemini, Anthropic) SANS aucune modification de code — pure config .env. MODEL_PROVIDER=openai signifie « cloud via LiteLLM » (pas forcement OpenAI) ; le prefixe avant le / dans LITELLM_MODEL choisit le vrai fournisseur.</w:t>
+      </w:r>
+    </w:p>
+    <w:tbl>
+      <w:tblPr>
+        <w:tblStyle w:val="TableGrid"/>
+        <w:tblW w:type="auto" w:w="0"/>
+        <w:tblLook w:firstColumn="1" w:firstRow="1" w:lastColumn="0" w:lastRow="0" w:noHBand="0" w:noVBand="1" w:val="04A0"/>
+      </w:tblPr>
+      <w:tblGrid>
+        <w:gridCol w:w="2409"/>
+        <w:gridCol w:w="2409"/>
+        <w:gridCol w:w="2409"/>
+        <w:gridCol w:w="2409"/>
+      </w:tblGrid>
+      <w:tr>
+        <w:tc>
+          <w:tcPr>
+            <w:tcW w:type="dxa" w:w="2154"/>
+          </w:tcPr>
+          <w:p>
+            <w:pPr>
+              <w:shd w:val="clear" w:fill="EDE7FB"/>
+            </w:pPr>
+            <w:r/>
+            <w:r>
+              <w:rPr>
+                <w:b/>
+                <w:sz w:val="20"/>
+              </w:rPr>
+              <w:t>Fournisseur</w:t>
+            </w:r>
+          </w:p>
+        </w:tc>
+        <w:tc>
+          <w:tcPr>
+            <w:tcW w:type="dxa" w:w="1701"/>
+          </w:tcPr>
+          <w:p>
+            <w:pPr>
+              <w:shd w:val="clear" w:fill="EDE7FB"/>
+            </w:pPr>
+            <w:r/>
+            <w:r>
+              <w:rPr>
+                <w:b/>
+                <w:sz w:val="20"/>
+              </w:rPr>
+              <w:t>MODEL_PROVIDER</w:t>
+            </w:r>
+          </w:p>
+        </w:tc>
+        <w:tc>
+          <w:tcPr>
+            <w:tcW w:type="dxa" w:w="3402"/>
+          </w:tcPr>
+          <w:p>
+            <w:pPr>
+              <w:shd w:val="clear" w:fill="EDE7FB"/>
+            </w:pPr>
+            <w:r/>
+            <w:r>
+              <w:rPr>
+                <w:b/>
+                <w:sz w:val="20"/>
+              </w:rPr>
+              <w:t>LITELLM_MODEL (exemple)</w:t>
+            </w:r>
+          </w:p>
+        </w:tc>
+        <w:tc>
+          <w:tcPr>
+            <w:tcW w:type="dxa" w:w="2381"/>
+          </w:tcPr>
+          <w:p>
+            <w:pPr>
+              <w:shd w:val="clear" w:fill="EDE7FB"/>
+            </w:pPr>
+            <w:r/>
+            <w:r>
+              <w:rPr>
+                <w:b/>
+                <w:sz w:val="20"/>
+              </w:rPr>
+              <w:t>Variable de cle</w:t>
+            </w:r>
+          </w:p>
+        </w:tc>
+      </w:tr>
+      <w:tr>
+        <w:tc>
+          <w:tcPr>
+            <w:tcW w:type="dxa" w:w="2154"/>
+          </w:tcPr>
+          <w:p>
+            <w:r/>
+            <w:r>
+              <w:rPr>
+                <w:sz w:val="20"/>
+              </w:rPr>
+              <w:t>Ollama (local, defaut)</w:t>
+            </w:r>
+          </w:p>
+        </w:tc>
+        <w:tc>
+          <w:tcPr>
+            <w:tcW w:type="dxa" w:w="1701"/>
+          </w:tcPr>
+          <w:p>
+            <w:r/>
+            <w:r>
+              <w:rPr>
+                <w:sz w:val="20"/>
+              </w:rPr>
+              <w:t>ollama</w:t>
+            </w:r>
+          </w:p>
+        </w:tc>
+        <w:tc>
+          <w:tcPr>
+            <w:tcW w:type="dxa" w:w="3402"/>
+          </w:tcPr>
+          <w:p>
+            <w:r/>
+            <w:r>
+              <w:rPr>
+                <w:sz w:val="20"/>
+              </w:rPr>
+              <w:t>— (utilise OLLAMA_MODEL)</w:t>
+            </w:r>
+          </w:p>
+        </w:tc>
+        <w:tc>
+          <w:tcPr>
+            <w:tcW w:type="dxa" w:w="2381"/>
+          </w:tcPr>
+          <w:p>
+            <w:r/>
+            <w:r>
+              <w:rPr>
+                <w:sz w:val="20"/>
+              </w:rPr>
+              <w:t>—</w:t>
+            </w:r>
+          </w:p>
+        </w:tc>
+      </w:tr>
+      <w:tr>
+        <w:tc>
+          <w:tcPr>
+            <w:tcW w:type="dxa" w:w="2154"/>
+          </w:tcPr>
+          <w:p>
+            <w:r/>
+            <w:r>
+              <w:rPr>
+                <w:sz w:val="20"/>
+              </w:rPr>
+              <w:t>Groq</w:t>
+            </w:r>
+          </w:p>
+        </w:tc>
+        <w:tc>
+          <w:tcPr>
+            <w:tcW w:type="dxa" w:w="1701"/>
+          </w:tcPr>
+          <w:p>
+            <w:r/>
+            <w:r>
+              <w:rPr>
+                <w:sz w:val="20"/>
+              </w:rPr>
+              <w:t>openai</w:t>
+            </w:r>
+          </w:p>
+        </w:tc>
+        <w:tc>
+          <w:tcPr>
+            <w:tcW w:type="dxa" w:w="3402"/>
+          </w:tcPr>
+          <w:p>
+            <w:r/>
+            <w:r>
+              <w:rPr>
+                <w:sz w:val="20"/>
+              </w:rPr>
+              <w:t>groq/openai/gpt-oss-20b</w:t>
+            </w:r>
+          </w:p>
+        </w:tc>
+        <w:tc>
+          <w:tcPr>
+            <w:tcW w:type="dxa" w:w="2381"/>
+          </w:tcPr>
+          <w:p>
+            <w:r/>
+            <w:r>
+              <w:rPr>
+                <w:sz w:val="20"/>
+              </w:rPr>
+              <w:t>GROQ_API_KEY</w:t>
+            </w:r>
+          </w:p>
+        </w:tc>
+      </w:tr>
+      <w:tr>
+        <w:tc>
+          <w:tcPr>
+            <w:tcW w:type="dxa" w:w="2154"/>
+          </w:tcPr>
+          <w:p>
+            <w:r/>
+            <w:r>
+              <w:rPr>
+                <w:sz w:val="20"/>
+              </w:rPr>
+              <w:t>OpenAI</w:t>
+            </w:r>
+          </w:p>
+        </w:tc>
+        <w:tc>
+          <w:tcPr>
+            <w:tcW w:type="dxa" w:w="1701"/>
+          </w:tcPr>
+          <w:p>
+            <w:r/>
+            <w:r>
+              <w:rPr>
+                <w:sz w:val="20"/>
+              </w:rPr>
+              <w:t>openai</w:t>
+            </w:r>
+          </w:p>
+        </w:tc>
+        <w:tc>
+          <w:tcPr>
+            <w:tcW w:type="dxa" w:w="3402"/>
+          </w:tcPr>
+          <w:p>
+            <w:r/>
+            <w:r>
+              <w:rPr>
+                <w:sz w:val="20"/>
+              </w:rPr>
+              <w:t>openai/gpt-4o-mini</w:t>
+            </w:r>
+          </w:p>
+        </w:tc>
+        <w:tc>
+          <w:tcPr>
+            <w:tcW w:type="dxa" w:w="2381"/>
+          </w:tcPr>
+          <w:p>
+            <w:r/>
+            <w:r>
+              <w:rPr>
+                <w:sz w:val="20"/>
+              </w:rPr>
+              <w:t>OPENAI_API_KEY</w:t>
+            </w:r>
+          </w:p>
+        </w:tc>
+      </w:tr>
+      <w:tr>
+        <w:tc>
+          <w:tcPr>
+            <w:tcW w:type="dxa" w:w="2154"/>
+          </w:tcPr>
+          <w:p>
+            <w:r/>
+            <w:r>
+              <w:rPr>
+                <w:sz w:val="20"/>
+              </w:rPr>
+              <w:t>Google Gemini</w:t>
+            </w:r>
+          </w:p>
+        </w:tc>
+        <w:tc>
+          <w:tcPr>
+            <w:tcW w:type="dxa" w:w="1701"/>
+          </w:tcPr>
+          <w:p>
+            <w:r/>
+            <w:r>
+              <w:rPr>
+                <w:sz w:val="20"/>
+              </w:rPr>
+              <w:t>openai</w:t>
+            </w:r>
+          </w:p>
+        </w:tc>
+        <w:tc>
+          <w:tcPr>
+            <w:tcW w:type="dxa" w:w="3402"/>
+          </w:tcPr>
+          <w:p>
+            <w:r/>
+            <w:r>
+              <w:rPr>
+                <w:sz w:val="20"/>
+              </w:rPr>
+              <w:t>gemini/gemini-2.0-flash</w:t>
+            </w:r>
+          </w:p>
+        </w:tc>
+        <w:tc>
+          <w:tcPr>
+            <w:tcW w:type="dxa" w:w="2381"/>
+          </w:tcPr>
+          <w:p>
+            <w:r/>
+            <w:r>
+              <w:rPr>
+                <w:sz w:val="20"/>
+              </w:rPr>
+              <w:t>GEMINI_API_KEY</w:t>
+            </w:r>
+          </w:p>
+        </w:tc>
+      </w:tr>
+      <w:tr>
+        <w:tc>
+          <w:tcPr>
+            <w:tcW w:type="dxa" w:w="2154"/>
+          </w:tcPr>
+          <w:p>
+            <w:r/>
+            <w:r>
+              <w:rPr>
+                <w:sz w:val="20"/>
+              </w:rPr>
+              <w:t>Anthropic</w:t>
+            </w:r>
+          </w:p>
+        </w:tc>
+        <w:tc>
+          <w:tcPr>
+            <w:tcW w:type="dxa" w:w="1701"/>
+          </w:tcPr>
+          <w:p>
+            <w:r/>
+            <w:r>
+              <w:rPr>
+                <w:sz w:val="20"/>
+              </w:rPr>
+              <w:t>openai</w:t>
+            </w:r>
+          </w:p>
+        </w:tc>
+        <w:tc>
+          <w:tcPr>
+            <w:tcW w:type="dxa" w:w="3402"/>
+          </w:tcPr>
+          <w:p>
+            <w:r/>
+            <w:r>
+              <w:rPr>
+                <w:sz w:val="20"/>
+              </w:rPr>
+              <w:t>anthropic/claude-3-5-haiku-latest</w:t>
+            </w:r>
+          </w:p>
+        </w:tc>
+        <w:tc>
+          <w:tcPr>
+            <w:tcW w:type="dxa" w:w="2381"/>
+          </w:tcPr>
+          <w:p>
+            <w:r/>
+            <w:r>
+              <w:rPr>
+                <w:sz w:val="20"/>
+              </w:rPr>
+              <w:t>ANTHROPIC_API_KEY</w:t>
+            </w:r>
+          </w:p>
+        </w:tc>
+      </w:tr>
+    </w:tbl>
+    <w:p>
+      <w:r>
+        <w:t>Pour basculer la cible sur un fournisseur cloud (exemple Groq), mettre ces trois lignes dans .env puis relancer :</w:t>
+      </w:r>
+    </w:p>
+    <w:p>
+      <w:pPr>
+        <w:shd w:val="clear" w:fill="F2F2F2"/>
+        <w:spacing w:after="0" w:before="0"/>
+      </w:pPr>
+      <w:r>
+        <w:rPr>
+          <w:rFonts w:ascii="Consolas" w:hAnsi="Consolas"/>
+          <w:sz w:val="19"/>
+        </w:rPr>
+        <w:t>MODEL_PROVIDER=openai</w:t>
+      </w:r>
+    </w:p>
+    <w:p>
+      <w:pPr>
+        <w:shd w:val="clear" w:fill="F2F2F2"/>
+        <w:spacing w:after="0" w:before="0"/>
+      </w:pPr>
+      <w:r>
+        <w:rPr>
+          <w:rFonts w:ascii="Consolas" w:hAnsi="Consolas"/>
+          <w:sz w:val="19"/>
+        </w:rPr>
+        <w:t>LITELLM_MODEL=groq/openai/gpt-oss-20b</w:t>
+      </w:r>
+    </w:p>
+    <w:p>
+      <w:pPr>
+        <w:shd w:val="clear" w:fill="F2F2F2"/>
+        <w:spacing w:after="0" w:before="0"/>
+      </w:pPr>
+      <w:r>
+        <w:rPr>
+          <w:rFonts w:ascii="Consolas" w:hAnsi="Consolas"/>
+          <w:sz w:val="19"/>
+        </w:rPr>
+        <w:t>GROQ_API_KEY=gsk_xxx</w:t>
+      </w:r>
+    </w:p>
+    <w:p>
+      <w:pPr>
+        <w:shd w:val="clear" w:fill="F2F2F2"/>
+        <w:spacing w:after="0" w:before="0"/>
+      </w:pPr>
+      <w:r>
+        <w:rPr>
+          <w:rFonts w:ascii="Consolas" w:hAnsi="Consolas"/>
+          <w:sz w:val="19"/>
+        </w:rPr>
+        <w:t xml:space="preserve"> </w:t>
+      </w:r>
+    </w:p>
+    <w:p>
+      <w:pPr>
+        <w:shd w:val="clear" w:fill="F2F2F2"/>
+        <w:spacing w:after="0" w:before="0"/>
+      </w:pPr>
+      <w:r>
+        <w:rPr>
+          <w:rFonts w:ascii="Consolas" w:hAnsi="Consolas"/>
+          <w:sz w:val="19"/>
+        </w:rPr>
+        <w:t>./pwnzzai.sh restart</w:t>
+      </w:r>
+    </w:p>
+    <w:p>
+      <w:pPr>
+        <w:spacing w:after="80"/>
+      </w:pPr>
+    </w:p>
+    <w:p>
+      <w:pPr>
+        <w:shd w:val="clear" w:fill="FFF4D6"/>
+      </w:pPr>
+      <w:r>
+        <w:rPr>
+          <w:sz w:val="21"/>
+        </w:rPr>
+        <w:t>Seuls les labs cloud openai_* utilisent ce backend ; les labs ollama_* utilisent toujours Ollama local, donc garde le service ollama actif. La cle reste dans .env (gitignore) — ne la committe jamais.</w:t>
+      </w:r>
+    </w:p>
+    <w:p>
+      <w:pPr>
+        <w:pStyle w:val="Heading1"/>
+      </w:pPr>
+      <w:r>
+        <w:t>8. Depannage</w:t>
       </w:r>
     </w:p>
     <w:tbl>
@@ -2117,7 +2593,7 @@
         <w:pStyle w:val="Heading1"/>
       </w:pPr>
       <w:r>
-        <w:t>8. Desinstaller</w:t>
+        <w:t>9. Desinstaller</w:t>
       </w:r>
     </w:p>
     <w:p>

</xml_diff>

<commit_message>
docs(install): Groq par défaut = llama-3.3-70b + guides .docx FR/EN régénérés
- STUDENT-INSTALL FR/EN : exemple Groq recommandé passé de gpt-oss-20b
  (reasoning, réponses vides testées) à groq/llama-3.3-70b-versatile,
  + check rapide de validité de clé (curl 200/401).
- Régénère GUIDE-INSTALL-ELEVE.docx (FR) depuis le markdown.
- Ajoute build_eleve_guide_en.py + GUIDE-INSTALL-STUDENT-EN.docx (parité EN).

Co-Authored-By: Claude Opus 4.8 (1M context) <noreply@anthropic.com>
</commit_message>
<xml_diff>
--- a/docs/GUIDE-INSTALL-ELEVE.docx
+++ b/docs/GUIDE-INSTALL-ELEVE.docx
@@ -4057,7 +4057,7 @@
               <w:rPr>
                 <w:sz w:val="20"/>
               </w:rPr>
-              <w:t>Groq</w:t>
+              <w:t>Groq (recommande)</w:t>
             </w:r>
           </w:p>
         </w:tc>
@@ -4087,7 +4087,7 @@
                 <w:rFonts w:ascii="Consolas" w:hAnsi="Consolas"/>
                 <w:sz w:val="20"/>
               </w:rPr>
-              <w:t>groq/openai/gpt-oss-20b</w:t>
+              <w:t>groq/llama-3.3-70b-versatile</w:t>
             </w:r>
           </w:p>
         </w:tc>
@@ -4337,7 +4337,7 @@
           <w:rFonts w:ascii="Consolas" w:hAnsi="Consolas"/>
           <w:sz w:val="19"/>
         </w:rPr>
-        <w:t>LITELLM_MODEL=groq/openai/gpt-oss-20b</w:t>
+        <w:t>LITELLM_MODEL=groq/llama-3.3-70b-versatile</w:t>
       </w:r>
     </w:p>
     <w:p>
@@ -4397,6 +4397,190 @@
       </w:r>
       <w:r>
         <w:t xml:space="preserve"> (gitignore) — ne la committe jamais.</w:t>
+      </w:r>
+    </w:p>
+    <w:p>
+      <w:pPr>
+        <w:shd w:val="clear" w:fill="FFF4D6"/>
+      </w:pPr>
+      <w:r>
+        <w:rPr>
+          <w:b/>
+          <w:sz w:val="21"/>
+        </w:rPr>
+        <w:t>Si la cible reste sur Ollama malgre la config Groq</w:t>
+      </w:r>
+      <w:r>
+        <w:rPr>
+          <w:sz w:val="21"/>
+        </w:rPr>
+        <w:t xml:space="preserve"> : dans l'interface du lab, choisis bien l'option </w:t>
+      </w:r>
+      <w:r>
+        <w:rPr>
+          <w:b/>
+          <w:sz w:val="21"/>
+        </w:rPr>
+        <w:t>cloud</w:t>
+      </w:r>
+      <w:r>
+        <w:rPr>
+          <w:sz w:val="21"/>
+        </w:rPr>
+        <w:t xml:space="preserve"> (le bouton/onglet du fournisseur). Les pages web envoient le fournisseur explicitement ; un appel API brut sans ce choix retombe sur Ollama (le defaut interne reste </w:t>
+      </w:r>
+      <w:r>
+        <w:rPr>
+          <w:rFonts w:ascii="Consolas" w:hAnsi="Consolas"/>
+          <w:sz w:val="21"/>
+        </w:rPr>
+        <w:t>auto</w:t>
+      </w:r>
+      <w:r>
+        <w:rPr>
+          <w:sz w:val="21"/>
+        </w:rPr>
+        <w:t>). Detail connu du produit OWASP — voir UPSTREAM-NOTES.md.</w:t>
+      </w:r>
+    </w:p>
+    <w:p>
+      <w:pPr>
+        <w:shd w:val="clear" w:fill="FFF4D6"/>
+      </w:pPr>
+      <w:r>
+        <w:rPr>
+          <w:b/>
+          <w:sz w:val="21"/>
+        </w:rPr>
+        <w:t>Reponses vides en cloud</w:t>
+      </w:r>
+      <w:r>
+        <w:rPr>
+          <w:sz w:val="21"/>
+        </w:rPr>
+        <w:t xml:space="preserve"> : evite </w:t>
+      </w:r>
+      <w:r>
+        <w:rPr>
+          <w:rFonts w:ascii="Consolas" w:hAnsi="Consolas"/>
+          <w:sz w:val="21"/>
+        </w:rPr>
+        <w:t>groq/openai/gpt-oss-20b</w:t>
+      </w:r>
+      <w:r>
+        <w:rPr>
+          <w:sz w:val="21"/>
+        </w:rPr>
+        <w:t xml:space="preserve"> — c'est un modele *reasoning* qui renvoie souvent du vide (teste : </w:t>
+      </w:r>
+      <w:r>
+        <w:rPr>
+          <w:rFonts w:ascii="Consolas" w:hAnsi="Consolas"/>
+          <w:sz w:val="21"/>
+        </w:rPr>
+        <w:t>HTTP 500</w:t>
+      </w:r>
+      <w:r>
+        <w:rPr>
+          <w:sz w:val="21"/>
+        </w:rPr>
+        <w:t xml:space="preserve"> / </w:t>
+      </w:r>
+      <w:r>
+        <w:rPr>
+          <w:rFonts w:ascii="Consolas" w:hAnsi="Consolas"/>
+          <w:sz w:val="21"/>
+        </w:rPr>
+        <w:t>response:""</w:t>
+      </w:r>
+      <w:r>
+        <w:rPr>
+          <w:sz w:val="21"/>
+        </w:rPr>
+        <w:t xml:space="preserve"> sur certains labs). Reste sur </w:t>
+      </w:r>
+      <w:r>
+        <w:rPr>
+          <w:rFonts w:ascii="Consolas" w:hAnsi="Consolas"/>
+          <w:sz w:val="21"/>
+        </w:rPr>
+        <w:t>groq/llama-3.3-70b-versatile</w:t>
+      </w:r>
+      <w:r>
+        <w:rPr>
+          <w:sz w:val="21"/>
+        </w:rPr>
+        <w:t xml:space="preserve"> (non-reasoning, fiable).</w:t>
+      </w:r>
+    </w:p>
+    <w:p>
+      <w:pPr>
+        <w:shd w:val="clear" w:fill="FFF4D6"/>
+      </w:pPr>
+      <w:r>
+        <w:rPr>
+          <w:b/>
+          <w:sz w:val="21"/>
+        </w:rPr>
+        <w:t>Verifier que la cle est valide</w:t>
+      </w:r>
+      <w:r>
+        <w:rPr>
+          <w:sz w:val="21"/>
+        </w:rPr>
+        <w:t xml:space="preserve"> : une cle Groq commence par </w:t>
+      </w:r>
+      <w:r>
+        <w:rPr>
+          <w:rFonts w:ascii="Consolas" w:hAnsi="Consolas"/>
+          <w:sz w:val="21"/>
+        </w:rPr>
+        <w:t>gsk_</w:t>
+      </w:r>
+      <w:r>
+        <w:rPr>
+          <w:sz w:val="21"/>
+        </w:rPr>
+        <w:t xml:space="preserve">. Test rapide : </w:t>
+      </w:r>
+      <w:r>
+        <w:rPr>
+          <w:rFonts w:ascii="Consolas" w:hAnsi="Consolas"/>
+          <w:sz w:val="21"/>
+        </w:rPr>
+        <w:t>curl -s -o /dev/null -w "%{http_code}\n" https://api.groq.com/openai/v1/models -H "Authorization: Bearer gsk_..."</w:t>
+      </w:r>
+      <w:r>
+        <w:rPr>
+          <w:sz w:val="21"/>
+        </w:rPr>
+        <w:t xml:space="preserve"> doit renvoyer </w:t>
+      </w:r>
+      <w:r>
+        <w:rPr>
+          <w:rFonts w:ascii="Consolas" w:hAnsi="Consolas"/>
+          <w:sz w:val="21"/>
+        </w:rPr>
+        <w:t>200</w:t>
+      </w:r>
+      <w:r>
+        <w:rPr>
+          <w:sz w:val="21"/>
+        </w:rPr>
+        <w:t xml:space="preserve"> (un </w:t>
+      </w:r>
+      <w:r>
+        <w:rPr>
+          <w:rFonts w:ascii="Consolas" w:hAnsi="Consolas"/>
+          <w:sz w:val="21"/>
+        </w:rPr>
+        <w:t>401</w:t>
+      </w:r>
+      <w:r>
+        <w:rPr>
+          <w:sz w:val="21"/>
+        </w:rPr>
+        <w:t xml:space="preserve"> = cle invalide).</w:t>
       </w:r>
     </w:p>
     <w:p>

</xml_diff>

<commit_message>
docs(install): section "Comment ta réussite arrive chez le prof" (FR/EN + docx)
Documente le flux preuve manquant: inscription cohorte par email
(pending → validation prof), "Vérifier ma réussite" → push auto de
challenge_solved vers le dashboard (/api/sync), preuve signée
téléchargeable (HMAC), et comportement mode solo. Libellés UI repris
du i18n coach. Docx FR/EN régénérés depuis les markdown.

Co-Authored-By: Claude Opus 4.8 (1M context) <noreply@anthropic.com>
</commit_message>
<xml_diff>
--- a/docs/GUIDE-INSTALL-ELEVE.docx
+++ b/docs/GUIDE-INSTALL-ELEVE.docx
@@ -3466,6 +3466,271 @@
         </w:tc>
       </w:tr>
     </w:tbl>
+    <w:p>
+      <w:pPr>
+        <w:pStyle w:val="Heading2"/>
+      </w:pPr>
+      <w:r>
+        <w:t>Comment ta reussite arrive chez le prof (mode cohorte)</w:t>
+      </w:r>
+    </w:p>
+    <w:p>
+      <w:r>
+        <w:t xml:space="preserve">Tu n'envoies </w:t>
+      </w:r>
+      <w:r>
+        <w:rPr>
+          <w:b/>
+        </w:rPr>
+        <w:t>rien a la main</w:t>
+      </w:r>
+      <w:r>
+        <w:t xml:space="preserve"> : le coach s'en charge. En trois temps.</w:t>
+      </w:r>
+    </w:p>
+    <w:p>
+      <w:pPr>
+        <w:pStyle w:val="ListNumber"/>
+      </w:pPr>
+      <w:r>
+        <w:rPr>
+          <w:b/>
+        </w:rPr>
+        <w:t>Inscris-toi a la cohorte (une fois).</w:t>
+      </w:r>
+      <w:r>
+        <w:t xml:space="preserve"> Dans le panneau coach, bloc </w:t>
+      </w:r>
+      <w:r>
+        <w:rPr>
+          <w:b/>
+        </w:rPr>
+        <w:t>« Rejoins ta cohorte (pour que le prof te suive) »</w:t>
+      </w:r>
+      <w:r>
+        <w:t xml:space="preserve"> : saisis </w:t>
+      </w:r>
+      <w:r>
+        <w:rPr>
+          <w:b/>
+        </w:rPr>
+        <w:t>ton email</w:t>
+      </w:r>
+      <w:r>
+        <w:t xml:space="preserve"> et clique </w:t>
+      </w:r>
+      <w:r>
+        <w:rPr>
+          <w:b/>
+        </w:rPr>
+        <w:t>« Rejoindre la cohorte »</w:t>
+      </w:r>
+      <w:r>
+        <w:t xml:space="preserve">. Ton statut passe a </w:t>
+      </w:r>
+      <w:r>
+        <w:rPr>
+          <w:b/>
+        </w:rPr>
+        <w:t>« En attente d'approbation du prof »</w:t>
+      </w:r>
+      <w:r>
+        <w:t xml:space="preserve">, puis a </w:t>
+      </w:r>
+      <w:r>
+        <w:rPr>
+          <w:b/>
+        </w:rPr>
+        <w:t>« Inscrit »</w:t>
+      </w:r>
+      <w:r>
+        <w:t xml:space="preserve"> une fois que le prof a valide ta demande cote dashboard. L'email est l'</w:t>
+      </w:r>
+      <w:r>
+        <w:rPr>
+          <w:b/>
+        </w:rPr>
+        <w:t>identite</w:t>
+      </w:r>
+      <w:r>
+        <w:t xml:space="preserve"> que le prof voit dans sa liste (en plus du label de ton poste).</w:t>
+      </w:r>
+    </w:p>
+    <w:p>
+      <w:pPr>
+        <w:pStyle w:val="ListNumber"/>
+      </w:pPr>
+      <w:r>
+        <w:rPr>
+          <w:b/>
+        </w:rPr>
+        <w:t>Valide un lab.</w:t>
+      </w:r>
+      <w:r>
+        <w:t xml:space="preserve"> Apres avoir attaque l'assistant, onglet </w:t>
+      </w:r>
+      <w:r>
+        <w:rPr>
+          <w:b/>
+        </w:rPr>
+        <w:t>Progression</w:t>
+      </w:r>
+      <w:r>
+        <w:t xml:space="preserve"> → </w:t>
+      </w:r>
+      <w:r>
+        <w:rPr>
+          <w:b/>
+        </w:rPr>
+        <w:t>« Verifier ma reussite »</w:t>
+      </w:r>
+      <w:r>
+        <w:t xml:space="preserve">. Si le </w:t>
+      </w:r>
+      <w:r>
+        <w:rPr>
+          <w:b/>
+        </w:rPr>
+        <w:t>juge</w:t>
+      </w:r>
+      <w:r>
+        <w:t xml:space="preserve"> rend *Reussi*, le coach </w:t>
+      </w:r>
+      <w:r>
+        <w:rPr>
+          <w:b/>
+        </w:rPr>
+        <w:t>pousse automatiquement</w:t>
+      </w:r>
+      <w:r>
+        <w:t xml:space="preserve"> un evenement </w:t>
+      </w:r>
+      <w:r>
+        <w:rPr>
+          <w:rFonts w:ascii="Consolas" w:hAnsi="Consolas"/>
+        </w:rPr>
+        <w:t>challenge_solved</w:t>
+      </w:r>
+      <w:r>
+        <w:t xml:space="preserve"> vers le dashboard du prof (POST interne </w:t>
+      </w:r>
+      <w:r>
+        <w:rPr>
+          <w:rFonts w:ascii="Consolas" w:hAnsi="Consolas"/>
+        </w:rPr>
+        <w:t>/api/sync</w:t>
+      </w:r>
+      <w:r>
+        <w:t>). Aucune action de plus de ta part.</w:t>
+      </w:r>
+    </w:p>
+    <w:p>
+      <w:pPr>
+        <w:pStyle w:val="ListNumber"/>
+      </w:pPr>
+      <w:r>
+        <w:rPr>
+          <w:b/>
+        </w:rPr>
+        <w:t>Recupere ta preuve signee (optionnel).</w:t>
+      </w:r>
+      <w:r>
+        <w:t xml:space="preserve"> Une fois le </w:t>
+      </w:r>
+      <w:r>
+        <w:rPr>
+          <w:rFonts w:ascii="Consolas" w:hAnsi="Consolas"/>
+        </w:rPr>
+        <w:t>challenge_solved</w:t>
+      </w:r>
+      <w:r>
+        <w:t xml:space="preserve"> recu, le dashboard </w:t>
+      </w:r>
+      <w:r>
+        <w:rPr>
+          <w:b/>
+        </w:rPr>
+        <w:t>signe</w:t>
+      </w:r>
+      <w:r>
+        <w:t xml:space="preserve"> une preuve (HMAC-SHA256). Bouton </w:t>
+      </w:r>
+      <w:r>
+        <w:rPr>
+          <w:b/>
+        </w:rPr>
+        <w:t>« Telecharger la preuve »</w:t>
+      </w:r>
+      <w:r>
+        <w:t xml:space="preserve"> : tu obtiens un fichier markdown signe par le serveur (la preuve n'existe </w:t>
+      </w:r>
+      <w:r>
+        <w:rPr>
+          <w:b/>
+        </w:rPr>
+        <w:t>que</w:t>
+      </w:r>
+      <w:r>
+        <w:t xml:space="preserve"> si le dashboard a bien recu ta reussite — sinon « Preuve indisponible »).</w:t>
+      </w:r>
+    </w:p>
+    <w:p>
+      <w:pPr>
+        <w:shd w:val="clear" w:fill="FFF4D6"/>
+      </w:pPr>
+      <w:r>
+        <w:rPr>
+          <w:b/>
+          <w:sz w:val="21"/>
+        </w:rPr>
+        <w:t>Rien ne part sans dashboard.</w:t>
+      </w:r>
+      <w:r>
+        <w:rPr>
+          <w:sz w:val="21"/>
+        </w:rPr>
+        <w:t xml:space="preserve"> En </w:t>
+      </w:r>
+      <w:r>
+        <w:rPr>
+          <w:b/>
+          <w:sz w:val="21"/>
+        </w:rPr>
+        <w:t>mode solo</w:t>
+      </w:r>
+      <w:r>
+        <w:rPr>
+          <w:sz w:val="21"/>
+        </w:rPr>
+        <w:t xml:space="preserve"> (pas de </w:t>
+      </w:r>
+      <w:r>
+        <w:rPr>
+          <w:rFonts w:ascii="Consolas" w:hAnsi="Consolas"/>
+          <w:sz w:val="21"/>
+        </w:rPr>
+        <w:t>-d</w:t>
+      </w:r>
+      <w:r>
+        <w:rPr>
+          <w:sz w:val="21"/>
+        </w:rPr>
+        <w:t xml:space="preserve">), il n'y a ni inscription ni envoi : </w:t>
+      </w:r>
+      <w:r>
+        <w:rPr>
+          <w:rFonts w:ascii="Consolas" w:hAnsi="Consolas"/>
+          <w:sz w:val="21"/>
+        </w:rPr>
+        <w:t>challenge_solved</w:t>
+      </w:r>
+      <w:r>
+        <w:rPr>
+          <w:sz w:val="21"/>
+        </w:rPr>
+        <w:t xml:space="preserve"> reste local, et « Telecharger la preuve » n'est pas disponible. La securite est cote serveur : la cohorte et la signature sont gerees par le dashboard, un eleve ne peut pas falsifier la preuve d'un autre depuis son navigateur.</w:t>
+      </w:r>
+    </w:p>
     <w:p>
       <w:r>
         <w:t>Si quelque chose echoue, voir § 6 ci-dessous.</w:t>

</xml_diff>